<commit_message>
feat: Phase 217 — canonical Hermes status builder; align portal/state/docs from one source
build_hermes_canonical_status.py merges live /api/v2/hermes/* + systemd into data/runtime/
hermes_canonical_status_latest.json. researcher-matrix endpoint now reads it (deep lane 'built + nightly-
scheduled' not 'designed (not enabled)'; lanes show live status; serverops HOLD/P1). Matrix .md/.docx
regenerated from the snapshot (timestamped, source-of-truth note). QA: no stale claims, no secrets. Docs/
index/responsibility-matrix point to the canonical matrix. Read-only; no v2 UI; no trading/scoring touched.

Co-Authored-By: Claude Opus 4.8 (1M context) <noreply@anthropic.com>
</commit_message>
<xml_diff>
--- a/docs/hermes/HERMES_AGENTS_WORKFLOWS_SOULS_AND_SELF_LEARNING_MATRIX.docx
+++ b/docs/hermes/HERMES_AGENTS_WORKFLOWS_SOULS_AND_SELF_LEARNING_MATRIX.docx
@@ -26,9 +26,11 @@
           <w:color w:val="666666"/>
           <w:sz w:val="22"/>
         </w:rPr>
-        <w:t>TradeAI v12 · ms01-openclaw · rebuilt from live v3 portal truth</w:t>
+        <w:t>TradeAI v12 · ms01-openclaw · generated from canonical status snapshot</w:t>
         <w:br/>
-        <w:t>2026-06-07 · advisory-only · paper-only · live trading PROHIBITED</w:t>
+        <w:t>2026-06-07T18:06:14.590864</w:t>
+        <w:br/>
+        <w:t>advisory-only · paper-only · live trading PROHIBITED</w:t>
       </w:r>
     </w:p>
     <w:p>
@@ -46,7 +48,7 @@
     </w:p>
     <w:p>
       <w:r>
-        <w:t>Hermes is the research &amp; self-learning layer that improves TradeAI v12 over time — it never trades. This document is regenerated from the live Command Center v3 / /api/v2/hermes/* API (source of truth), with GitHub/Drive architecture docs as supporting references. It supersedes earlier generated docs where they disagreed with the portal.</w:t>
+        <w:t>Hermes is the research &amp; self-learning layer that improves TradeAI v12 over time — it never trades. This document is generated from the single canonical status snapshot (data/runtime/hermes_canonical_status_latest.json) built from live /api/v2/hermes/* + systemd state, so portal/state/docs agree.</w:t>
       </w:r>
     </w:p>
     <w:p>
@@ -59,7 +61,7 @@
     </w:p>
     <w:p>
       <w:r>
-        <w:t>1) Live v3 portal/API (canonical). 2) This matrix. 3) Architecture reference doc. 4) Older generated docs (deprecated where conflicting).</w:t>
+        <w:t>1) Canonical status JSON (built from live API). 2) This matrix (.md/.docx). 3) Architecture reference. 4) Older generated docs (deprecated where conflicting).</w:t>
       </w:r>
     </w:p>
     <w:p>
@@ -67,7 +69,7 @@
         <w:pStyle w:val="Heading1"/>
       </w:pPr>
       <w:r>
-        <w:t>3. Live v3 portal snapshot (2026-06-07)</w:t>
+        <w:t>3. Live portal snapshot</w:t>
       </w:r>
     </w:p>
     <w:tbl>
@@ -213,7 +215,7 @@
           </w:tcPr>
           <w:p>
             <w:r>
-              <w:t>false</w:t>
+              <w:t>False</w:t>
             </w:r>
           </w:p>
         </w:tc>
@@ -257,7 +259,7 @@
           </w:tcPr>
           <w:p>
             <w:r>
-              <w:t>INACTIVE · data/runtime/HERMES_DISABLED (retired ignored)</w:t>
+              <w:t>INACTIVE · data/runtime/HERMES_DISABLED</w:t>
             </w:r>
           </w:p>
         </w:tc>
@@ -269,7 +271,7 @@
           </w:tcPr>
           <w:p>
             <w:r>
-              <w:t>Retired/legacy agents</w:t>
+              <w:t>Retired agents</w:t>
             </w:r>
           </w:p>
         </w:tc>
@@ -279,7 +281,7 @@
           </w:tcPr>
           <w:p>
             <w:r>
-              <w:t>24 (gateway disabled)</w:t>
+              <w:t>24 (gateway failed/disabled)</w:t>
             </w:r>
           </w:p>
         </w:tc>
@@ -291,7 +293,7 @@
         <w:pStyle w:val="Heading1"/>
       </w:pPr>
       <w:r>
-        <w:t>4. Hermes global profiles</w:t>
+        <w:t>4. Profiles</w:t>
       </w:r>
     </w:p>
     <w:tbl>
@@ -387,7 +389,7 @@
           </w:tcPr>
           <w:p>
             <w:r>
-              <w:t>none</w:t>
+              <w:t>disabled</w:t>
             </w:r>
           </w:p>
         </w:tc>
@@ -429,7 +431,7 @@
           </w:tcPr>
           <w:p>
             <w:r>
-              <w:t>none</w:t>
+              <w:t>disabled</w:t>
             </w:r>
           </w:p>
         </w:tc>
@@ -471,7 +473,7 @@
           </w:tcPr>
           <w:p>
             <w:r>
-              <w:t>none</w:t>
+              <w:t>disabled</w:t>
             </w:r>
           </w:p>
         </w:tc>
@@ -513,7 +515,7 @@
           </w:tcPr>
           <w:p>
             <w:r>
-              <w:t>14 (no terminal/code_exec/computer_use)</w:t>
+              <w:t>14 enabled: web, browser, file, vision, image_gen, tts, skills, todo, memory, session_search, clarify, delegation, cronjob, messaging</w:t>
             </w:r>
           </w:p>
         </w:tc>
@@ -555,7 +557,7 @@
           </w:tcPr>
           <w:p>
             <w:r>
-              <w:t>18 incl terminal/code_execution/computer_use (P1 hardening)</w:t>
+              <w:t>18 enabled: web, browser, terminal, file, code_execution, vision, image_gen, x_search, tts, skills, todo, memory, session_search, clarify, delegation, cronjob, messaging, computer_use</w:t>
             </w:r>
           </w:p>
         </w:tc>
@@ -577,7 +579,7 @@
         <w:pStyle w:val="Heading1"/>
       </w:pPr>
       <w:r>
-        <w:t>7. LLM / Auth lane matrix</w:t>
+        <w:t>7. LLM / Auth lanes</w:t>
       </w:r>
     </w:p>
     <w:tbl>
@@ -628,7 +630,7 @@
               <w:rPr>
                 <w:b/>
               </w:rPr>
-              <w:t>Headless automation</w:t>
+              <w:t>Headless</w:t>
             </w:r>
           </w:p>
         </w:tc>
@@ -641,7 +643,7 @@
               <w:rPr>
                 <w:b/>
               </w:rPr>
-              <w:t>Notes</w:t>
+              <w:t>Reason</w:t>
             </w:r>
           </w:p>
         </w:tc>
@@ -663,7 +665,7 @@
           </w:tcPr>
           <w:p>
             <w:r>
-              <w:t>YES</w:t>
+              <w:t>True</w:t>
             </w:r>
           </w:p>
         </w:tc>
@@ -673,7 +675,7 @@
           </w:tcPr>
           <w:p>
             <w:r>
-              <w:t>unavailable (hermes_headless_limit)</w:t>
+              <w:t>unavailable</w:t>
             </w:r>
           </w:p>
         </w:tc>
@@ -683,7 +685,7 @@
           </w:tcPr>
           <w:p>
             <w:r>
-              <w:t>interactive only; runtime enabled=false</w:t>
+              <w:t>hermes_headless_limit</w:t>
             </w:r>
           </w:p>
         </w:tc>
@@ -705,7 +707,7 @@
           </w:tcPr>
           <w:p>
             <w:r>
-              <w:t>YES</w:t>
+              <w:t>True</w:t>
             </w:r>
           </w:p>
         </w:tc>
@@ -725,7 +727,49 @@
           </w:tcPr>
           <w:p>
             <w:r>
-              <w:t>free xai-oauth proxy :8645</w:t>
+              <w:t>ok</w:t>
+            </w:r>
+          </w:p>
+        </w:tc>
+      </w:tr>
+      <w:tr>
+        <w:tc>
+          <w:tcPr>
+            <w:tcW w:type="dxa" w:w="2160"/>
+          </w:tcPr>
+          <w:p>
+            <w:r>
+              <w:t>Nous Portal</w:t>
+            </w:r>
+          </w:p>
+        </w:tc>
+        <w:tc>
+          <w:tcPr>
+            <w:tcW w:type="dxa" w:w="2160"/>
+          </w:tcPr>
+          <w:p>
+            <w:r>
+              <w:t>False</w:t>
+            </w:r>
+          </w:p>
+        </w:tc>
+        <w:tc>
+          <w:tcPr>
+            <w:tcW w:type="dxa" w:w="2160"/>
+          </w:tcPr>
+          <w:p>
+            <w:r>
+              <w:t>auth_pending</w:t>
+            </w:r>
+          </w:p>
+        </w:tc>
+        <w:tc>
+          <w:tcPr>
+            <w:tcW w:type="dxa" w:w="2160"/>
+          </w:tcPr>
+          <w:p>
+            <w:r>
+              <w:t>auth_pending</w:t>
             </w:r>
           </w:p>
         </w:tc>
@@ -747,7 +791,7 @@
           </w:tcPr>
           <w:p>
             <w:r>
-              <w:t>YES</w:t>
+              <w:t>True</w:t>
             </w:r>
           </w:p>
         </w:tc>
@@ -767,49 +811,7 @@
           </w:tcPr>
           <w:p>
             <w:r>
-              <w:t>add Anthropic credits</w:t>
-            </w:r>
-          </w:p>
-        </w:tc>
-      </w:tr>
-      <w:tr>
-        <w:tc>
-          <w:tcPr>
-            <w:tcW w:type="dxa" w:w="2160"/>
-          </w:tcPr>
-          <w:p>
-            <w:r>
-              <w:t>Nous Portal</w:t>
-            </w:r>
-          </w:p>
-        </w:tc>
-        <w:tc>
-          <w:tcPr>
-            <w:tcW w:type="dxa" w:w="2160"/>
-          </w:tcPr>
-          <w:p>
-            <w:r>
-              <w:t>NO</w:t>
-            </w:r>
-          </w:p>
-        </w:tc>
-        <w:tc>
-          <w:tcPr>
-            <w:tcW w:type="dxa" w:w="2160"/>
-          </w:tcPr>
-          <w:p>
-            <w:r>
-              <w:t>auth_pending</w:t>
-            </w:r>
-          </w:p>
-        </w:tc>
-        <w:tc>
-          <w:tcPr>
-            <w:tcW w:type="dxa" w:w="2160"/>
-          </w:tcPr>
-          <w:p>
-            <w:r>
-              <w:t>hermes auth add nous --type oauth</w:t>
+              <w:t>anthropic_credits_required</w:t>
             </w:r>
           </w:p>
         </w:tc>
@@ -831,7 +833,7 @@
           </w:tcPr>
           <w:p>
             <w:r>
-              <w:t>YES</w:t>
+              <w:t>True</w:t>
             </w:r>
           </w:p>
         </w:tc>
@@ -851,7 +853,7 @@
           </w:tcPr>
           <w:p>
             <w:r>
-              <w:t>primary automated lane</w:t>
+              <w:t>ok</w:t>
             </w:r>
           </w:p>
         </w:tc>
@@ -868,7 +870,7 @@
     </w:p>
     <w:p>
       <w:r>
-        <w:t>Closed-loop PARTIAL (by design): 11 loops · 11 advisory-only · 9 feed prompts · 0 mutate scoring (operator-gated). Each loop drill-down-able in v3 (process steps, queued/completed, timestamps).</w:t>
+        <w:t>Closed-loop PARTIAL (by design): 11 loops · 9 feed prompts · 0 mutate scoring (operator-gated). Each loop drill-down-able in v3 (process steps, queued/completed, timestamps).</w:t>
       </w:r>
     </w:p>
     <w:p>
@@ -876,12 +878,12 @@
         <w:pStyle w:val="Heading1"/>
       </w:pPr>
       <w:r>
-        <w:t>13–15. Feedback / internal deep / external lanes</w:t>
+        <w:t>14. Internal deep research lane</w:t>
       </w:r>
     </w:p>
     <w:p>
       <w:r>
-        <w:t>External feedback loop scores recommendation usefulness daily (advisory). Internal deep lane: gemma3:27b designed/operator-run, scheduled nightly 02:30. External lanes: Grok live (free), Codex interactive-only, Claude credits, Nous pending, Consensus designed.</w:t>
+        <w:t>Status: built + nightly-scheduled (advisory/staging, operator-run). Model gemma3:27b / gemma3-overnight; runner scripts/hermes_deep_research_local.py; timer enabled=True (daily 02:30 local (overnight-gated)); writes hermes_research_intelligence (staging). advisory/staging-only; kill-switch + health-gate; --apply self-gated to overnight.</w:t>
       </w:r>
     </w:p>
     <w:p>
@@ -889,12 +891,25 @@
         <w:pStyle w:val="Heading1"/>
       </w:pPr>
       <w:r>
-        <w:t>16. Retired sidecar / legacy agents</w:t>
+        <w:t>15. External lanes (Codex split)</w:t>
       </w:r>
     </w:p>
     <w:p>
       <w:r>
-        <w:t>24 retired items (audit-only); gateway failed/disabled. Do not enable the gateway or execute retired wrappers; directories not deleted.</w:t>
+        <w:t>ChatGPT/Codex: auth_ready=True, interactive_ready=True, headless_available=False (hermes_headless_limit), runtime_enabled=False. Usage: hermes -p dev chat (interactive only on Hermes 0.16.0). Grok=live free (xai-oauth proxy); Claude=credits_required; Nous=auth_pending; Local=ready.</w:t>
+      </w:r>
+    </w:p>
+    <w:p>
+      <w:pPr>
+        <w:pStyle w:val="Heading1"/>
+      </w:pPr>
+      <w:r>
+        <w:t>16. serverops (P1)</w:t>
+      </w:r>
+    </w:p>
+    <w:p>
+      <w:r>
+        <w:t>serverops: 18 tools enabled — UNSAFE — terminal/code_execution/computer_use enabled. P1 hardening required=True. Not hardened in this phase (documented only).</w:t>
       </w:r>
     </w:p>
     <w:p>
@@ -907,7 +922,7 @@
     </w:p>
     <w:p>
       <w:r>
-        <w:t>Per-profile: tradeai/tradeai12b = advisory analyst, tool-less, evidence-first, keep no-execution boundary. dev = Codex coding (high-risk tools off). serverops = HOLD (P1: disable terminal/code_execution/computer_use).</w:t>
+        <w:t>tradeai/tradeai12b = advisory analyst, tool-less, evidence-first, keep no-execution boundary. dev = Codex coding (high-risk tools off). serverops = HOLD (P1: disable terminal/code_execution/computer_use).</w:t>
       </w:r>
     </w:p>
     <w:p>
@@ -938,12 +953,32 @@
         <w:pStyle w:val="Heading1"/>
       </w:pPr>
       <w:r>
-        <w:t>20. Open gaps &amp; next gates</w:t>
+        <w:t>20. Open gates</w:t>
       </w:r>
     </w:p>
     <w:p>
       <w:r>
-        <w:t>P1 remaining: harden serverops dangerous tools (kill-switch repoint DONE Phase 214). Self-learning gaps: research_backlog table; shadow-efficacy &lt; graft sample. Codex headless blocked on Hermes 0.16.0 (auto-recovers on newer build). Claude needs credits; Nous needs OAuth; gemma4 deferred.</w:t>
+        <w:t>• P1: harden serverops dangerous tools (terminal/code_execution/computer_use)</w:t>
+      </w:r>
+    </w:p>
+    <w:p>
+      <w:r>
+        <w:t>• self-learning: dedicated research_backlog table</w:t>
+      </w:r>
+    </w:p>
+    <w:p>
+      <w:r>
+        <w:t>• shadow-efficacy &lt; graft sample (keep advisory)</w:t>
+      </w:r>
+    </w:p>
+    <w:p>
+      <w:r>
+        <w:t>• Codex headless: blocked on Hermes 0.16.0 (auto-recovers on newer build)</w:t>
+      </w:r>
+    </w:p>
+    <w:p>
+      <w:r>
+        <w:t>• Claude: add Anthropic credits; Nous: complete OAuth; gemma4: deferred</w:t>
       </w:r>
     </w:p>
     <w:sectPr>
@@ -968,7 +1003,7 @@
         <w:color w:val="888888"/>
         <w:sz w:val="16"/>
       </w:rPr>
-      <w:t>Hermes Agents/Workflows/SOULs &amp; Self-Learning Matrix — advisory-only, regenerated from live v3 portal truth (2026-06-07). No secrets.</w:t>
+      <w:t>Hermes Matrix — advisory-only, generated from canonical status snapshot 2026-06-07T18:06:14.590864. No secrets.</w:t>
     </w:r>
   </w:p>
 </w:ftr>

</xml_diff>